<commit_message>
Améliorer la fiche et le bâton des tables
</commit_message>
<xml_diff>
--- a/_sources/defi-tables/fiche_tables_multiplication.docx
+++ b/_sources/defi-tables/fiche_tables_multiplication.docx
@@ -105,7 +105,7 @@
                 <w:rFonts w:ascii="Arial" w:hAnsi="Arial"/>
                 <w:b/>
                 <w:color w:val="123452"/>
-                <w:sz w:val="43"/>
+                <w:sz w:val="39"/>
               </w:rPr>
               <w:t>MES TABLES</w:t>
               <w:br/>
@@ -115,7 +115,7 @@
                 <w:rFonts w:ascii="Arial" w:hAnsi="Arial"/>
                 <w:b/>
                 <w:color w:val="123452"/>
-                <w:sz w:val="36"/>
+                <w:sz w:val="31"/>
               </w:rPr>
               <w:t>DE MULTIPLICATION</w:t>
             </w:r>

</xml_diff>

<commit_message>
Améliorer la fiche et le bâton des tables (#569)
</commit_message>
<xml_diff>
--- a/_sources/defi-tables/fiche_tables_multiplication.docx
+++ b/_sources/defi-tables/fiche_tables_multiplication.docx
@@ -105,7 +105,7 @@
                 <w:rFonts w:ascii="Arial" w:hAnsi="Arial"/>
                 <w:b/>
                 <w:color w:val="123452"/>
-                <w:sz w:val="43"/>
+                <w:sz w:val="39"/>
               </w:rPr>
               <w:t>MES TABLES</w:t>
               <w:br/>
@@ -115,7 +115,7 @@
                 <w:rFonts w:ascii="Arial" w:hAnsi="Arial"/>
                 <w:b/>
                 <w:color w:val="123452"/>
-                <w:sz w:val="36"/>
+                <w:sz w:val="31"/>
               </w:rPr>
               <w:t>DE MULTIPLICATION</w:t>
             </w:r>

</xml_diff>